<commit_message>
V22 - Fixed v4 errata
</commit_message>
<xml_diff>
--- a/Front Matter/Bonecas Russas_Text_Translation.docx
+++ b/Front Matter/Bonecas Russas_Text_Translation.docx
@@ -828,47 +828,29 @@
           <w:color w:val="000000" w:themeColor="text1"/>
           <w:lang w:val="pt-BR"/>
         </w:rPr>
-        <w:t xml:space="preserve">Com olho dentro dos olhos observo teu corpo de manhã; com dedos dentro dos dedos toquei você ontem a noite. </w:t>
-      </w:r>
-      <w:proofErr w:type="spellStart"/>
-      <w:r>
-        <w:rPr>
-          <w:color w:val="000000" w:themeColor="text1"/>
-          <w:lang w:val="pt-BR"/>
-        </w:rPr>
-        <w:t>Minh</w:t>
-      </w:r>
-      <w:r>
-        <w:rPr>
-          <w:color w:val="000000" w:themeColor="text1"/>
-          <w:lang w:val="pt-BR"/>
-        </w:rPr>
-        <w:t>ã</w:t>
-      </w:r>
-      <w:proofErr w:type="spellEnd"/>
-      <w:r>
-        <w:rPr>
-          <w:color w:val="000000" w:themeColor="text1"/>
-          <w:lang w:val="pt-BR"/>
-        </w:rPr>
-        <w:t xml:space="preserve"> saliva antiga bebeu a tua, não a nova, e em </w:t>
-      </w:r>
-      <w:proofErr w:type="spellStart"/>
-      <w:r>
-        <w:rPr>
-          <w:color w:val="000000" w:themeColor="text1"/>
-          <w:lang w:val="pt-BR"/>
-        </w:rPr>
-        <w:t>minh</w:t>
-      </w:r>
-      <w:r>
-        <w:rPr>
-          <w:color w:val="000000" w:themeColor="text1"/>
-          <w:lang w:val="pt-BR"/>
-        </w:rPr>
-        <w:t>ã</w:t>
-      </w:r>
-      <w:proofErr w:type="spellEnd"/>
+        <w:t>Com olho dentro dos olhos observo teu corpo de manhã; com dedos dentro dos dedos toquei você ontem a noite. Minh</w:t>
+      </w:r>
+      <w:r>
+        <w:rPr>
+          <w:color w:val="000000" w:themeColor="text1"/>
+          <w:lang w:val="pt-BR"/>
+        </w:rPr>
+        <w:t>a</w:t>
+      </w:r>
+      <w:r>
+        <w:rPr>
+          <w:color w:val="000000" w:themeColor="text1"/>
+          <w:lang w:val="pt-BR"/>
+        </w:rPr>
+        <w:t xml:space="preserve"> saliva antiga bebeu a tua, não a nova, e em minh</w:t>
+      </w:r>
+      <w:r>
+        <w:rPr>
+          <w:color w:val="000000" w:themeColor="text1"/>
+          <w:lang w:val="pt-BR"/>
+        </w:rPr>
+        <w:t>a</w:t>
+      </w:r>
       <w:r>
         <w:rPr>
           <w:color w:val="000000" w:themeColor="text1"/>

</xml_diff>